<commit_message>
remove geo reference in title of paper
</commit_message>
<xml_diff>
--- a/draft-paper.docx
+++ b/draft-paper.docx
@@ -30,17 +30,7 @@
           <w:sz w:val="56"/>
           <w:szCs w:val="56"/>
         </w:rPr>
-        <w:t xml:space="preserve"> is Driving Shifts in Seasonal Homicide Patterns in </w:t>
-      </w:r>
-      <w:r>
-        <w:rPr>
-          <w:rFonts w:asciiTheme="majorHAnsi" w:eastAsiaTheme="majorEastAsia" w:hAnsiTheme="majorHAnsi" w:cstheme="majorBidi"/>
-          <w:spacing w:val="-10"/>
-          <w:kern w:val="28"/>
-          <w:sz w:val="56"/>
-          <w:szCs w:val="56"/>
-        </w:rPr>
-        <w:t>Equatorial Nations</w:t>
+        <w:t xml:space="preserve"> is Driving Shifts in Seasonal Homicide Patterns</w:t>
       </w:r>
     </w:p>
     <w:p>
@@ -1153,6 +1143,7 @@
   <w:style w:type="character" w:default="1" w:styleId="DefaultParagraphFont">
     <w:name w:val="Default Paragraph Font"/>
     <w:uiPriority w:val="1"/>
+    <w:semiHidden/>
     <w:unhideWhenUsed/>
   </w:style>
   <w:style w:type="table" w:default="1" w:styleId="TableNormal">

</xml_diff>